<commit_message>
Add study/lab guides and update attendance
Add Template_Guia_Estudio and multiple DOCX/PDF study guides and lab materials for Unidad_1 and Unidad_2 (e.g. CIA/ZeroTrust, Normativas/Estandares/CicloDeVida, DMZ/VLANs/NGFW/IDS, Nmap/Wireshark). Remove .gitkeep from Unidad_1 guides and update existing Unidad_1 S2 guide files. Also modify Administracion/Lista_Asistencia_ASS_CRN236396.xlsx.
</commit_message>
<xml_diff>
--- a/Unidad_1_Fundamentos/Guias_de_Estudio/Guia_Estudio_U1_S2_Normativas_Estandares_CicloDeVida.docx
+++ b/Unidad_1_Fundamentos/Guias_de_Estudio/Guia_Estudio_U1_S2_Normativas_Estandares_CicloDeVida.docx
@@ -122,221 +122,304 @@
         <w:tblLook w:val="04A0" w:firstRow="1" w:lastRow="0" w:firstColumn="1" w:lastColumn="0" w:noHBand="0" w:noVBand="1"/>
       </w:tblPr>
       <w:tblGrid>
-        <w:gridCol w:w="2219"/>
-        <w:gridCol w:w="2301"/>
-        <w:gridCol w:w="2191"/>
-        <w:gridCol w:w="2649"/>
+        <w:gridCol w:w="2340"/>
+        <w:gridCol w:w="2340"/>
+        <w:gridCol w:w="2340"/>
+        <w:gridCol w:w="2340"/>
       </w:tblGrid>
       <w:tr>
-        <w:tc>
-          <w:tcPr>
-            <w:tcW w:w="0" w:type="auto"/>
-            <w:tcBorders>
-              <w:top w:val="single" w:sz="1" w:space="0" w:color="CCCCCC"/>
-              <w:left w:val="single" w:sz="1" w:space="0" w:color="CCCCCC"/>
-              <w:bottom w:val="single" w:sz="1" w:space="0" w:color="CCCCCC"/>
-              <w:right w:val="single" w:sz="1" w:space="0" w:color="CCCCCC"/>
-            </w:tcBorders>
-            <w:shd w:val="clear" w:color="auto" w:fill="0F3D22"/>
-            <w:tcMar>
-              <w:top w:w="140" w:type="dxa"/>
-              <w:left w:w="160" w:type="dxa"/>
-              <w:bottom w:w="140" w:type="dxa"/>
-              <w:right w:w="160" w:type="dxa"/>
-            </w:tcMar>
-          </w:tcPr>
-          <w:p>
-            <w:pPr>
-              <w:spacing w:after="40"/>
-              <w:jc w:val="center"/>
-            </w:pPr>
-            <w:r>
-              <w:rPr>
-                <w:b/>
-                <w:bCs/>
-                <w:color w:val="CCFFDD"/>
-                <w:sz w:val="18"/>
-                <w:szCs w:val="18"/>
-              </w:rPr>
-              <w:t>UNIDAD</w:t>
-            </w:r>
-          </w:p>
+        <w:tblPrEx>
+          <w:tblCellMar>
+            <w:top w:w="0" w:type="dxa"/>
+            <w:bottom w:w="0" w:type="dxa"/>
+          </w:tblCellMar>
+        </w:tblPrEx>
+        <w:tc>
+          <w:tcPr>
+            <w:tcW w:w="2340" w:type="dxa"/>
+            <w:tcBorders>
+              <w:top w:val="single" w:sz="4" w:space="0" w:color="AAAAAA"/>
+              <w:left w:val="single" w:sz="4" w:space="0" w:color="AAAAAA"/>
+              <w:bottom w:val="single" w:sz="4" w:space="0" w:color="AAAAAA"/>
+              <w:right w:val="single" w:sz="4" w:space="0" w:color="AAAAAA"/>
+            </w:tcBorders>
+            <w:shd w:val="clear" w:color="auto" w:fill="FFFFFF"/>
+            <w:tcMar>
+              <w:top w:w="80" w:type="dxa"/>
+              <w:left w:w="120" w:type="dxa"/>
+              <w:bottom w:w="80" w:type="dxa"/>
+              <w:right w:w="120" w:type="dxa"/>
+            </w:tcMar>
+            <w:vAlign w:val="center"/>
+          </w:tcPr>
           <w:p>
             <w:pPr>
               <w:jc w:val="center"/>
             </w:pPr>
             <w:r>
               <w:rPr>
+                <w:rFonts w:ascii="Arial" w:eastAsia="Arial" w:hAnsi="Arial" w:cs="Arial"/>
                 <w:b/>
                 <w:bCs/>
-                <w:color w:val="FFFFFF"/>
-              </w:rPr>
-              <w:t>[Unidad 1]</w:t>
-            </w:r>
-          </w:p>
-        </w:tc>
-        <w:tc>
-          <w:tcPr>
-            <w:tcW w:w="0" w:type="auto"/>
-            <w:tcBorders>
-              <w:top w:val="single" w:sz="1" w:space="0" w:color="CCCCCC"/>
-              <w:left w:val="single" w:sz="1" w:space="0" w:color="CCCCCC"/>
-              <w:bottom w:val="single" w:sz="1" w:space="0" w:color="CCCCCC"/>
-              <w:right w:val="single" w:sz="1" w:space="0" w:color="CCCCCC"/>
-            </w:tcBorders>
-            <w:shd w:val="clear" w:color="auto" w:fill="1A5E36"/>
-            <w:tcMar>
-              <w:top w:w="140" w:type="dxa"/>
-              <w:left w:w="160" w:type="dxa"/>
-              <w:bottom w:w="140" w:type="dxa"/>
-              <w:right w:w="160" w:type="dxa"/>
-            </w:tcMar>
-          </w:tcPr>
-          <w:p>
-            <w:pPr>
-              <w:spacing w:after="40"/>
-              <w:jc w:val="center"/>
-            </w:pPr>
-            <w:r>
-              <w:rPr>
-                <w:b/>
-                <w:bCs/>
-                <w:color w:val="CCFFDD"/>
-                <w:sz w:val="18"/>
-                <w:szCs w:val="18"/>
-              </w:rPr>
-              <w:t>SEMANA</w:t>
-            </w:r>
-          </w:p>
+                <w:color w:val="000000"/>
+                <w:sz w:val="21"/>
+                <w:szCs w:val="21"/>
+              </w:rPr>
+              <w:t>UNIDAD</w:t>
+            </w:r>
+          </w:p>
+        </w:tc>
+        <w:tc>
+          <w:tcPr>
+            <w:tcW w:w="2340" w:type="dxa"/>
+            <w:tcBorders>
+              <w:top w:val="single" w:sz="4" w:space="0" w:color="AAAAAA"/>
+              <w:left w:val="single" w:sz="4" w:space="0" w:color="AAAAAA"/>
+              <w:bottom w:val="single" w:sz="4" w:space="0" w:color="AAAAAA"/>
+              <w:right w:val="single" w:sz="4" w:space="0" w:color="AAAAAA"/>
+            </w:tcBorders>
+            <w:shd w:val="clear" w:color="auto" w:fill="FFFFFF"/>
+            <w:tcMar>
+              <w:top w:w="80" w:type="dxa"/>
+              <w:left w:w="120" w:type="dxa"/>
+              <w:bottom w:w="80" w:type="dxa"/>
+              <w:right w:w="120" w:type="dxa"/>
+            </w:tcMar>
+            <w:vAlign w:val="center"/>
+          </w:tcPr>
           <w:p>
             <w:pPr>
               <w:jc w:val="center"/>
             </w:pPr>
             <w:r>
               <w:rPr>
+                <w:rFonts w:ascii="Arial" w:eastAsia="Arial" w:hAnsi="Arial" w:cs="Arial"/>
                 <w:b/>
                 <w:bCs/>
-                <w:color w:val="FFFFFF"/>
-              </w:rPr>
-              <w:t xml:space="preserve">[Semana </w:t>
-            </w:r>
-            <w:r>
-              <w:rPr>
-                <w:b/>
-                <w:bCs/>
-                <w:color w:val="FFFFFF"/>
-              </w:rPr>
-              <w:t>2</w:t>
-            </w:r>
-            <w:r>
-              <w:rPr>
-                <w:b/>
-                <w:bCs/>
-                <w:color w:val="FFFFFF"/>
-              </w:rPr>
-              <w:t>]</w:t>
-            </w:r>
-          </w:p>
-        </w:tc>
-        <w:tc>
-          <w:tcPr>
-            <w:tcW w:w="0" w:type="auto"/>
-            <w:tcBorders>
-              <w:top w:val="single" w:sz="1" w:space="0" w:color="CCCCCC"/>
-              <w:left w:val="single" w:sz="1" w:space="0" w:color="CCCCCC"/>
-              <w:bottom w:val="single" w:sz="1" w:space="0" w:color="CCCCCC"/>
-              <w:right w:val="single" w:sz="1" w:space="0" w:color="CCCCCC"/>
-            </w:tcBorders>
-            <w:shd w:val="clear" w:color="auto" w:fill="1F4E79"/>
-            <w:tcMar>
-              <w:top w:w="140" w:type="dxa"/>
-              <w:left w:w="160" w:type="dxa"/>
-              <w:bottom w:w="140" w:type="dxa"/>
-              <w:right w:w="160" w:type="dxa"/>
-            </w:tcMar>
-          </w:tcPr>
-          <w:p>
-            <w:pPr>
-              <w:spacing w:after="40"/>
-              <w:jc w:val="center"/>
-            </w:pPr>
-            <w:r>
-              <w:rPr>
-                <w:b/>
-                <w:bCs/>
-                <w:color w:val="CCFFDD"/>
-                <w:sz w:val="18"/>
-                <w:szCs w:val="18"/>
-              </w:rPr>
-              <w:t>TIPO</w:t>
-            </w:r>
-          </w:p>
+                <w:color w:val="000000"/>
+                <w:sz w:val="21"/>
+                <w:szCs w:val="21"/>
+              </w:rPr>
+              <w:t>SEMANA</w:t>
+            </w:r>
+          </w:p>
+        </w:tc>
+        <w:tc>
+          <w:tcPr>
+            <w:tcW w:w="2340" w:type="dxa"/>
+            <w:tcBorders>
+              <w:top w:val="single" w:sz="4" w:space="0" w:color="AAAAAA"/>
+              <w:left w:val="single" w:sz="4" w:space="0" w:color="AAAAAA"/>
+              <w:bottom w:val="single" w:sz="4" w:space="0" w:color="AAAAAA"/>
+              <w:right w:val="single" w:sz="4" w:space="0" w:color="AAAAAA"/>
+            </w:tcBorders>
+            <w:shd w:val="clear" w:color="auto" w:fill="FFFFFF"/>
+            <w:tcMar>
+              <w:top w:w="80" w:type="dxa"/>
+              <w:left w:w="120" w:type="dxa"/>
+              <w:bottom w:w="80" w:type="dxa"/>
+              <w:right w:w="120" w:type="dxa"/>
+            </w:tcMar>
+            <w:vAlign w:val="center"/>
+          </w:tcPr>
           <w:p>
             <w:pPr>
               <w:jc w:val="center"/>
             </w:pPr>
             <w:r>
               <w:rPr>
+                <w:rFonts w:ascii="Arial" w:eastAsia="Arial" w:hAnsi="Arial" w:cs="Arial"/>
                 <w:b/>
                 <w:bCs/>
-                <w:color w:val="FFFFFF"/>
-              </w:rPr>
-              <w:t>ESTUDIO</w:t>
-            </w:r>
-          </w:p>
-        </w:tc>
-        <w:tc>
-          <w:tcPr>
-            <w:tcW w:w="0" w:type="auto"/>
-            <w:tcBorders>
-              <w:top w:val="single" w:sz="1" w:space="0" w:color="CCCCCC"/>
-              <w:left w:val="single" w:sz="1" w:space="0" w:color="CCCCCC"/>
-              <w:bottom w:val="single" w:sz="1" w:space="0" w:color="CCCCCC"/>
-              <w:right w:val="single" w:sz="1" w:space="0" w:color="CCCCCC"/>
-            </w:tcBorders>
-            <w:shd w:val="clear" w:color="auto" w:fill="0D5E6E"/>
-            <w:tcMar>
-              <w:top w:w="140" w:type="dxa"/>
-              <w:left w:w="160" w:type="dxa"/>
-              <w:bottom w:w="140" w:type="dxa"/>
-              <w:right w:w="160" w:type="dxa"/>
-            </w:tcMar>
+                <w:color w:val="000000"/>
+                <w:sz w:val="21"/>
+                <w:szCs w:val="21"/>
+              </w:rPr>
+              <w:t>TIPO</w:t>
+            </w:r>
+          </w:p>
+        </w:tc>
+        <w:tc>
+          <w:tcPr>
+            <w:tcW w:w="2340" w:type="dxa"/>
+            <w:tcBorders>
+              <w:top w:val="single" w:sz="4" w:space="0" w:color="AAAAAA"/>
+              <w:left w:val="single" w:sz="4" w:space="0" w:color="AAAAAA"/>
+              <w:bottom w:val="single" w:sz="4" w:space="0" w:color="AAAAAA"/>
+              <w:right w:val="single" w:sz="4" w:space="0" w:color="AAAAAA"/>
+            </w:tcBorders>
+            <w:shd w:val="clear" w:color="auto" w:fill="FFFFFF"/>
+            <w:tcMar>
+              <w:top w:w="80" w:type="dxa"/>
+              <w:left w:w="120" w:type="dxa"/>
+              <w:bottom w:w="80" w:type="dxa"/>
+              <w:right w:w="120" w:type="dxa"/>
+            </w:tcMar>
+            <w:vAlign w:val="center"/>
           </w:tcPr>
           <w:p>
             <w:pPr>
-              <w:spacing w:after="40"/>
               <w:jc w:val="center"/>
-              <w:rPr>
-                <w:lang w:val="es-MX"/>
-              </w:rPr>
             </w:pPr>
             <w:r>
               <w:rPr>
+                <w:rFonts w:ascii="Arial" w:eastAsia="Arial" w:hAnsi="Arial" w:cs="Arial"/>
                 <w:b/>
                 <w:bCs/>
-                <w:color w:val="CCFFDD"/>
-                <w:sz w:val="18"/>
-                <w:szCs w:val="18"/>
-                <w:lang w:val="es-MX"/>
+                <w:color w:val="000000"/>
+                <w:sz w:val="21"/>
+                <w:szCs w:val="21"/>
               </w:rPr>
               <w:t>NIVEL</w:t>
             </w:r>
           </w:p>
+        </w:tc>
+      </w:tr>
+      <w:tr>
+        <w:tblPrEx>
+          <w:tblCellMar>
+            <w:top w:w="0" w:type="dxa"/>
+            <w:bottom w:w="0" w:type="dxa"/>
+          </w:tblCellMar>
+        </w:tblPrEx>
+        <w:tc>
+          <w:tcPr>
+            <w:tcW w:w="2340" w:type="dxa"/>
+            <w:tcBorders>
+              <w:top w:val="single" w:sz="4" w:space="0" w:color="AAAAAA"/>
+              <w:left w:val="single" w:sz="4" w:space="0" w:color="AAAAAA"/>
+              <w:bottom w:val="single" w:sz="4" w:space="0" w:color="AAAAAA"/>
+              <w:right w:val="single" w:sz="4" w:space="0" w:color="AAAAAA"/>
+            </w:tcBorders>
+            <w:shd w:val="clear" w:color="auto" w:fill="FFFFFF"/>
+            <w:tcMar>
+              <w:top w:w="80" w:type="dxa"/>
+              <w:left w:w="120" w:type="dxa"/>
+              <w:bottom w:w="80" w:type="dxa"/>
+              <w:right w:w="120" w:type="dxa"/>
+            </w:tcMar>
+            <w:vAlign w:val="center"/>
+          </w:tcPr>
           <w:p>
             <w:pPr>
               <w:jc w:val="center"/>
-              <w:rPr>
-                <w:lang w:val="es-MX"/>
-              </w:rPr>
             </w:pPr>
             <w:r>
               <w:rPr>
-                <w:b/>
-                <w:bCs/>
-                <w:color w:val="FFFFFF"/>
-                <w:lang w:val="es-MX"/>
-              </w:rPr>
-              <w:t>AVANZADO</w:t>
+                <w:rFonts w:ascii="Arial" w:eastAsia="Arial" w:hAnsi="Arial" w:cs="Arial"/>
+                <w:color w:val="000000"/>
+                <w:sz w:val="21"/>
+                <w:szCs w:val="21"/>
+              </w:rPr>
+              <w:t>U1</w:t>
+            </w:r>
+          </w:p>
+        </w:tc>
+        <w:tc>
+          <w:tcPr>
+            <w:tcW w:w="2340" w:type="dxa"/>
+            <w:tcBorders>
+              <w:top w:val="single" w:sz="4" w:space="0" w:color="AAAAAA"/>
+              <w:left w:val="single" w:sz="4" w:space="0" w:color="AAAAAA"/>
+              <w:bottom w:val="single" w:sz="4" w:space="0" w:color="AAAAAA"/>
+              <w:right w:val="single" w:sz="4" w:space="0" w:color="AAAAAA"/>
+            </w:tcBorders>
+            <w:shd w:val="clear" w:color="auto" w:fill="FFFFFF"/>
+            <w:tcMar>
+              <w:top w:w="80" w:type="dxa"/>
+              <w:left w:w="120" w:type="dxa"/>
+              <w:bottom w:w="80" w:type="dxa"/>
+              <w:right w:w="120" w:type="dxa"/>
+            </w:tcMar>
+            <w:vAlign w:val="center"/>
+          </w:tcPr>
+          <w:p>
+            <w:pPr>
+              <w:jc w:val="center"/>
+            </w:pPr>
+            <w:r>
+              <w:rPr>
+                <w:rFonts w:ascii="Arial" w:eastAsia="Arial" w:hAnsi="Arial" w:cs="Arial"/>
+                <w:color w:val="000000"/>
+                <w:sz w:val="21"/>
+                <w:szCs w:val="21"/>
+              </w:rPr>
+              <w:t xml:space="preserve">Sem </w:t>
+            </w:r>
+            <w:r>
+              <w:rPr>
+                <w:rFonts w:ascii="Arial" w:eastAsia="Arial" w:hAnsi="Arial" w:cs="Arial"/>
+                <w:color w:val="000000"/>
+                <w:sz w:val="21"/>
+                <w:szCs w:val="21"/>
+              </w:rPr>
+              <w:t>2</w:t>
+            </w:r>
+          </w:p>
+        </w:tc>
+        <w:tc>
+          <w:tcPr>
+            <w:tcW w:w="2340" w:type="dxa"/>
+            <w:tcBorders>
+              <w:top w:val="single" w:sz="4" w:space="0" w:color="AAAAAA"/>
+              <w:left w:val="single" w:sz="4" w:space="0" w:color="AAAAAA"/>
+              <w:bottom w:val="single" w:sz="4" w:space="0" w:color="AAAAAA"/>
+              <w:right w:val="single" w:sz="4" w:space="0" w:color="AAAAAA"/>
+            </w:tcBorders>
+            <w:shd w:val="clear" w:color="auto" w:fill="FFFFFF"/>
+            <w:tcMar>
+              <w:top w:w="80" w:type="dxa"/>
+              <w:left w:w="120" w:type="dxa"/>
+              <w:bottom w:w="80" w:type="dxa"/>
+              <w:right w:w="120" w:type="dxa"/>
+            </w:tcMar>
+            <w:vAlign w:val="center"/>
+          </w:tcPr>
+          <w:p>
+            <w:pPr>
+              <w:jc w:val="center"/>
+            </w:pPr>
+            <w:r>
+              <w:rPr>
+                <w:rFonts w:ascii="Arial" w:eastAsia="Arial" w:hAnsi="Arial" w:cs="Arial"/>
+                <w:color w:val="000000"/>
+                <w:sz w:val="21"/>
+                <w:szCs w:val="21"/>
+              </w:rPr>
+              <w:t>ESTUDIO</w:t>
+            </w:r>
+          </w:p>
+        </w:tc>
+        <w:tc>
+          <w:tcPr>
+            <w:tcW w:w="2340" w:type="dxa"/>
+            <w:tcBorders>
+              <w:top w:val="single" w:sz="4" w:space="0" w:color="AAAAAA"/>
+              <w:left w:val="single" w:sz="4" w:space="0" w:color="AAAAAA"/>
+              <w:bottom w:val="single" w:sz="4" w:space="0" w:color="AAAAAA"/>
+              <w:right w:val="single" w:sz="4" w:space="0" w:color="AAAAAA"/>
+            </w:tcBorders>
+            <w:shd w:val="clear" w:color="auto" w:fill="FFFFFF"/>
+            <w:tcMar>
+              <w:top w:w="80" w:type="dxa"/>
+              <w:left w:w="120" w:type="dxa"/>
+              <w:bottom w:w="80" w:type="dxa"/>
+              <w:right w:w="120" w:type="dxa"/>
+            </w:tcMar>
+            <w:vAlign w:val="center"/>
+          </w:tcPr>
+          <w:p>
+            <w:pPr>
+              <w:jc w:val="center"/>
+            </w:pPr>
+            <w:r>
+              <w:rPr>
+                <w:rFonts w:ascii="Arial" w:eastAsia="Arial" w:hAnsi="Arial" w:cs="Arial"/>
+                <w:color w:val="000000"/>
+                <w:sz w:val="21"/>
+                <w:szCs w:val="21"/>
+              </w:rPr>
+              <w:t>Avanzado</w:t>
             </w:r>
           </w:p>
         </w:tc>
@@ -352,113 +435,132 @@
     </w:p>
     <w:p>
       <w:pPr>
-        <w:spacing w:after="60"/>
+        <w:spacing w:before="60" w:after="60"/>
         <w:jc w:val="center"/>
-        <w:rPr>
-          <w:lang w:val="es-MX"/>
-        </w:rPr>
       </w:pPr>
       <w:r>
         <w:rPr>
-          <w:color w:val="777777"/>
-          <w:lang w:val="es-MX"/>
+          <w:rFonts w:ascii="Arial" w:eastAsia="Arial" w:hAnsi="Arial" w:cs="Arial"/>
+          <w:color w:val="444444"/>
         </w:rPr>
         <w:t>CUGDL — Universidad de Guadalajara</w:t>
       </w:r>
     </w:p>
     <w:p>
       <w:pPr>
-        <w:spacing w:after="80"/>
+        <w:spacing w:before="60" w:after="60"/>
         <w:jc w:val="center"/>
-        <w:rPr>
-          <w:color w:val="999999"/>
-          <w:lang w:val="es-MX"/>
-        </w:rPr>
       </w:pPr>
-      <w:r>
-        <w:rPr>
-          <w:color w:val="999999"/>
-          <w:lang w:val="es-MX"/>
-        </w:rPr>
-        <w:t>Arquitectura de Sistemas de Seguridad</w:t>
-      </w:r>
+      <w:proofErr w:type="spellStart"/>
+      <w:r>
+        <w:rPr>
+          <w:rFonts w:ascii="Arial" w:eastAsia="Arial" w:hAnsi="Arial" w:cs="Arial"/>
+          <w:color w:val="444444"/>
+        </w:rPr>
+        <w:t>Arquitectura</w:t>
+      </w:r>
+      <w:proofErr w:type="spellEnd"/>
+      <w:r>
+        <w:rPr>
+          <w:rFonts w:ascii="Arial" w:eastAsia="Arial" w:hAnsi="Arial" w:cs="Arial"/>
+          <w:color w:val="444444"/>
+        </w:rPr>
+        <w:t xml:space="preserve"> de Sistemas de </w:t>
+      </w:r>
+      <w:proofErr w:type="spellStart"/>
+      <w:r>
+        <w:rPr>
+          <w:rFonts w:ascii="Arial" w:eastAsia="Arial" w:hAnsi="Arial" w:cs="Arial"/>
+          <w:color w:val="444444"/>
+        </w:rPr>
+        <w:t>Seguridad</w:t>
+      </w:r>
+      <w:proofErr w:type="spellEnd"/>
     </w:p>
     <w:p>
       <w:pPr>
-        <w:spacing w:after="80"/>
+        <w:spacing w:before="60" w:after="60"/>
         <w:jc w:val="center"/>
-        <w:rPr>
-          <w:lang w:val="es-MX"/>
-        </w:rPr>
       </w:pPr>
-      <w:r>
-        <w:rPr>
-          <w:color w:val="999999"/>
-          <w:lang w:val="es-MX"/>
-        </w:rPr>
-        <w:t>L</w:t>
-      </w:r>
-      <w:r>
-        <w:rPr>
-          <w:color w:val="999999"/>
-          <w:lang w:val="es-MX"/>
-        </w:rPr>
-        <w:t>icenciatura en Ciberseguridad</w:t>
-      </w:r>
+      <w:proofErr w:type="spellStart"/>
+      <w:r>
+        <w:rPr>
+          <w:rFonts w:ascii="Arial" w:eastAsia="Arial" w:hAnsi="Arial" w:cs="Arial"/>
+          <w:color w:val="444444"/>
+        </w:rPr>
+        <w:t>Licenciatura</w:t>
+      </w:r>
+      <w:proofErr w:type="spellEnd"/>
+      <w:r>
+        <w:rPr>
+          <w:rFonts w:ascii="Arial" w:eastAsia="Arial" w:hAnsi="Arial" w:cs="Arial"/>
+          <w:color w:val="444444"/>
+        </w:rPr>
+        <w:t xml:space="preserve"> </w:t>
+      </w:r>
+      <w:proofErr w:type="spellStart"/>
+      <w:r>
+        <w:rPr>
+          <w:rFonts w:ascii="Arial" w:eastAsia="Arial" w:hAnsi="Arial" w:cs="Arial"/>
+          <w:color w:val="444444"/>
+        </w:rPr>
+        <w:t>en</w:t>
+      </w:r>
+      <w:proofErr w:type="spellEnd"/>
+      <w:r>
+        <w:rPr>
+          <w:rFonts w:ascii="Arial" w:eastAsia="Arial" w:hAnsi="Arial" w:cs="Arial"/>
+          <w:color w:val="444444"/>
+        </w:rPr>
+        <w:t xml:space="preserve"> </w:t>
+      </w:r>
+      <w:proofErr w:type="spellStart"/>
+      <w:r>
+        <w:rPr>
+          <w:rFonts w:ascii="Arial" w:eastAsia="Arial" w:hAnsi="Arial" w:cs="Arial"/>
+          <w:color w:val="444444"/>
+        </w:rPr>
+        <w:t>Ciberseguridad</w:t>
+      </w:r>
+      <w:proofErr w:type="spellEnd"/>
     </w:p>
     <w:p>
       <w:pPr>
-        <w:spacing w:after="40"/>
-        <w:jc w:val="center"/>
-        <w:rPr>
-          <w:lang w:val="es-MX"/>
-        </w:rPr>
+        <w:spacing w:before="40" w:after="40"/>
       </w:pPr>
-      <w:r>
-        <w:rPr>
-          <w:b/>
-          <w:bCs/>
-          <w:color w:val="0F3D22"/>
-          <w:sz w:val="24"/>
-          <w:szCs w:val="24"/>
-          <w:lang w:val="es-MX"/>
-        </w:rPr>
-        <w:t>Autor: Carlos Pulido Rosas</w:t>
-      </w:r>
     </w:p>
     <w:p>
       <w:pPr>
+        <w:spacing w:before="60" w:after="60"/>
         <w:jc w:val="center"/>
-        <w:rPr>
-          <w:lang w:val="es-MX"/>
-        </w:rPr>
       </w:pPr>
       <w:r>
         <w:rPr>
-          <w:i/>
-          <w:iCs/>
-          <w:color w:val="BBBBBB"/>
-          <w:lang w:val="es-MX"/>
-        </w:rPr>
-        <w:t>[</w:t>
-      </w:r>
-      <w:r>
-        <w:rPr>
-          <w:i/>
-          <w:iCs/>
-          <w:color w:val="BBBBBB"/>
-          <w:lang w:val="es-MX"/>
-        </w:rPr>
-        <w:t>marzo 2026</w:t>
-      </w:r>
-      <w:r>
-        <w:rPr>
-          <w:i/>
-          <w:iCs/>
-          <w:color w:val="BBBBBB"/>
-          <w:lang w:val="es-MX"/>
-        </w:rPr>
-        <w:t>]</w:t>
+          <w:rFonts w:ascii="Arial" w:eastAsia="Arial" w:hAnsi="Arial" w:cs="Arial"/>
+          <w:b/>
+          <w:bCs/>
+        </w:rPr>
+        <w:t>Autor: Carlos Pulido Rosas</w:t>
+      </w:r>
+    </w:p>
+    <w:p>
+      <w:pPr>
+        <w:spacing w:before="60" w:after="60"/>
+        <w:jc w:val="center"/>
+      </w:pPr>
+      <w:r>
+        <w:rPr>
+          <w:rFonts w:ascii="Arial" w:eastAsia="Arial" w:hAnsi="Arial" w:cs="Arial"/>
+          <w:color w:val="555555"/>
+        </w:rPr>
+        <w:t xml:space="preserve">Marzo </w:t>
+      </w:r>
+      <w:r>
+        <w:rPr>
+          <w:rFonts w:ascii="Arial" w:eastAsia="Arial" w:hAnsi="Arial" w:cs="Arial"/>
+          <w:color w:val="555555"/>
+        </w:rPr>
+        <w:t>2026</w:t>
       </w:r>
     </w:p>
     <w:p>
@@ -753,13 +855,86 @@
         <w:tblLook w:val="04A0" w:firstRow="1" w:lastRow="0" w:firstColumn="1" w:lastColumn="0" w:noHBand="0" w:noVBand="1"/>
       </w:tblPr>
       <w:tblGrid>
-        <w:gridCol w:w="620"/>
-        <w:gridCol w:w="8740"/>
+        <w:gridCol w:w="975"/>
+        <w:gridCol w:w="8385"/>
       </w:tblGrid>
       <w:tr>
         <w:tc>
           <w:tcPr>
             <w:tcW w:w="620" w:type="dxa"/>
+            <w:vMerge w:val="restart"/>
+            <w:tcBorders>
+              <w:top w:val="single" w:sz="4" w:space="0" w:color="CCCCCC"/>
+              <w:left w:val="single" w:sz="4" w:space="0" w:color="CCCCCC"/>
+              <w:right w:val="single" w:sz="4" w:space="0" w:color="CCCCCC"/>
+            </w:tcBorders>
+            <w:shd w:val="clear" w:color="auto" w:fill="F2F2F2"/>
+            <w:tcMar>
+              <w:top w:w="80" w:type="dxa"/>
+              <w:left w:w="100" w:type="dxa"/>
+              <w:bottom w:w="40" w:type="dxa"/>
+              <w:right w:w="80" w:type="dxa"/>
+            </w:tcMar>
+            <w:vAlign w:val="center"/>
+          </w:tcPr>
+          <w:p>
+            <w:pPr>
+              <w:jc w:val="center"/>
+              <w:rPr>
+                <w:lang w:val="es-MX"/>
+              </w:rPr>
+            </w:pPr>
+            <w:r>
+              <w:rPr>
+                <w:noProof/>
+              </w:rPr>
+              <w:drawing>
+                <wp:inline distT="0" distB="0" distL="0" distR="0" wp14:anchorId="4CCAEC7B" wp14:editId="1FDEF743">
+                  <wp:extent cx="504825" cy="504825"/>
+                  <wp:effectExtent l="0" t="0" r="0" b="9525"/>
+                  <wp:docPr id="1587542768" name="Graphic 1" descr="Idea with solid fill"/>
+                  <wp:cNvGraphicFramePr>
+                    <a:graphicFrameLocks xmlns:a="http://schemas.openxmlformats.org/drawingml/2006/main" noChangeAspect="1"/>
+                  </wp:cNvGraphicFramePr>
+                  <a:graphic xmlns:a="http://schemas.openxmlformats.org/drawingml/2006/main">
+                    <a:graphicData uri="http://schemas.openxmlformats.org/drawingml/2006/picture">
+                      <pic:pic xmlns:pic="http://schemas.openxmlformats.org/drawingml/2006/picture">
+                        <pic:nvPicPr>
+                          <pic:cNvPr id="1587542768" name="Graphic 1587542768" descr="Idea with solid fill"/>
+                          <pic:cNvPicPr/>
+                        </pic:nvPicPr>
+                        <pic:blipFill>
+                          <a:blip r:embed="rId8">
+                            <a:extLst>
+                              <a:ext uri="{96DAC541-7B7A-43D3-8B79-37D633B846F1}">
+                                <asvg:svgBlip xmlns:asvg="http://schemas.microsoft.com/office/drawing/2016/SVG/main" r:embed="rId9"/>
+                              </a:ext>
+                            </a:extLst>
+                          </a:blip>
+                          <a:stretch>
+                            <a:fillRect/>
+                          </a:stretch>
+                        </pic:blipFill>
+                        <pic:spPr>
+                          <a:xfrm>
+                            <a:off x="0" y="0"/>
+                            <a:ext cx="504825" cy="504825"/>
+                          </a:xfrm>
+                          <a:prstGeom prst="rect">
+                            <a:avLst/>
+                          </a:prstGeom>
+                        </pic:spPr>
+                      </pic:pic>
+                    </a:graphicData>
+                  </a:graphic>
+                </wp:inline>
+              </w:drawing>
+            </w:r>
+          </w:p>
+        </w:tc>
+        <w:tc>
+          <w:tcPr>
+            <w:tcW w:w="8740" w:type="dxa"/>
             <w:tcBorders>
               <w:top w:val="single" w:sz="4" w:space="0" w:color="CCCCCC"/>
               <w:left w:val="single" w:sz="4" w:space="0" w:color="CCCCCC"/>
@@ -769,6 +944,65 @@
             <w:shd w:val="clear" w:color="auto" w:fill="F2F2F2"/>
             <w:tcMar>
               <w:top w:w="80" w:type="dxa"/>
+              <w:left w:w="120" w:type="dxa"/>
+              <w:bottom w:w="40" w:type="dxa"/>
+              <w:right w:w="120" w:type="dxa"/>
+            </w:tcMar>
+          </w:tcPr>
+          <w:p>
+            <w:pPr>
+              <w:rPr>
+                <w:lang w:val="es-MX"/>
+              </w:rPr>
+            </w:pPr>
+            <w:r>
+              <w:rPr>
+                <w:rFonts w:ascii="Arial" w:eastAsia="Arial" w:hAnsi="Arial" w:cs="Arial"/>
+                <w:b/>
+                <w:bCs/>
+                <w:sz w:val="22"/>
+                <w:szCs w:val="22"/>
+                <w:lang w:val="es-MX"/>
+              </w:rPr>
+              <w:t xml:space="preserve">ANALOGÍA </w:t>
+            </w:r>
+            <w:r>
+              <w:rPr>
+                <w:rFonts w:ascii="Arial" w:eastAsia="Arial" w:hAnsi="Arial" w:cs="Arial"/>
+                <w:b/>
+                <w:bCs/>
+                <w:sz w:val="22"/>
+                <w:szCs w:val="22"/>
+                <w:lang w:val="es-MX"/>
+              </w:rPr>
+              <w:t>-</w:t>
+            </w:r>
+            <w:r>
+              <w:rPr>
+                <w:rFonts w:ascii="Arial" w:eastAsia="Arial" w:hAnsi="Arial" w:cs="Arial"/>
+                <w:b/>
+                <w:bCs/>
+                <w:sz w:val="22"/>
+                <w:szCs w:val="22"/>
+                <w:lang w:val="es-MX"/>
+              </w:rPr>
+              <w:t xml:space="preserve"> El arquitecto de software</w:t>
+            </w:r>
+          </w:p>
+        </w:tc>
+      </w:tr>
+      <w:tr>
+        <w:tc>
+          <w:tcPr>
+            <w:tcW w:w="620" w:type="dxa"/>
+            <w:vMerge/>
+            <w:tcBorders>
+              <w:left w:val="single" w:sz="4" w:space="0" w:color="CCCCCC"/>
+              <w:right w:val="single" w:sz="4" w:space="0" w:color="CCCCCC"/>
+            </w:tcBorders>
+            <w:shd w:val="clear" w:color="auto" w:fill="F2F2F2"/>
+            <w:tcMar>
+              <w:top w:w="80" w:type="dxa"/>
               <w:left w:w="100" w:type="dxa"/>
               <w:bottom w:w="40" w:type="dxa"/>
               <w:right w:w="80" w:type="dxa"/>
@@ -778,6 +1012,9 @@
           <w:p>
             <w:pPr>
               <w:jc w:val="center"/>
+              <w:rPr>
+                <w:lang w:val="es-MX"/>
+              </w:rPr>
             </w:pPr>
           </w:p>
         </w:tc>
@@ -800,6 +1037,7 @@
           </w:tcPr>
           <w:p>
             <w:pPr>
+              <w:spacing w:before="30" w:after="30"/>
               <w:rPr>
                 <w:lang w:val="es-MX"/>
               </w:rPr>
@@ -807,35 +1045,11 @@
             <w:r>
               <w:rPr>
                 <w:rFonts w:ascii="Arial" w:eastAsia="Arial" w:hAnsi="Arial" w:cs="Arial"/>
-                <w:b/>
-                <w:bCs/>
                 <w:sz w:val="22"/>
                 <w:szCs w:val="22"/>
                 <w:lang w:val="es-MX"/>
               </w:rPr>
-              <w:t xml:space="preserve">ANALOGÍA </w:t>
-            </w:r>
-            <w:r>
-              <w:rPr>
-                <w:rFonts w:ascii="Arial" w:eastAsia="Arial" w:hAnsi="Arial" w:cs="Arial"/>
-                <w:b/>
-                <w:bCs/>
-                <w:sz w:val="22"/>
-                <w:szCs w:val="22"/>
-                <w:lang w:val="es-MX"/>
-              </w:rPr>
-              <w:t>-</w:t>
-            </w:r>
-            <w:r>
-              <w:rPr>
-                <w:rFonts w:ascii="Arial" w:eastAsia="Arial" w:hAnsi="Arial" w:cs="Arial"/>
-                <w:b/>
-                <w:bCs/>
-                <w:sz w:val="22"/>
-                <w:szCs w:val="22"/>
-                <w:lang w:val="es-MX"/>
-              </w:rPr>
-              <w:t xml:space="preserve"> El arquitecto de software</w:t>
+              <w:t>ISO 27001 es como los requisitos no funcionales del sistema: defines qué debe cumplir.</w:t>
             </w:r>
           </w:p>
         </w:tc>
@@ -844,6 +1058,32 @@
         <w:tc>
           <w:tcPr>
             <w:tcW w:w="620" w:type="dxa"/>
+            <w:vMerge/>
+            <w:tcBorders>
+              <w:left w:val="single" w:sz="4" w:space="0" w:color="CCCCCC"/>
+              <w:right w:val="single" w:sz="4" w:space="0" w:color="CCCCCC"/>
+            </w:tcBorders>
+            <w:shd w:val="clear" w:color="auto" w:fill="F2F2F2"/>
+            <w:tcMar>
+              <w:top w:w="80" w:type="dxa"/>
+              <w:left w:w="100" w:type="dxa"/>
+              <w:bottom w:w="40" w:type="dxa"/>
+              <w:right w:w="80" w:type="dxa"/>
+            </w:tcMar>
+            <w:vAlign w:val="center"/>
+          </w:tcPr>
+          <w:p>
+            <w:pPr>
+              <w:jc w:val="center"/>
+              <w:rPr>
+                <w:lang w:val="es-MX"/>
+              </w:rPr>
+            </w:pPr>
+          </w:p>
+        </w:tc>
+        <w:tc>
+          <w:tcPr>
+            <w:tcW w:w="8740" w:type="dxa"/>
             <w:tcBorders>
               <w:top w:val="single" w:sz="4" w:space="0" w:color="CCCCCC"/>
               <w:left w:val="single" w:sz="4" w:space="0" w:color="CCCCCC"/>
@@ -853,33 +1093,6 @@
             <w:shd w:val="clear" w:color="auto" w:fill="F2F2F2"/>
             <w:tcMar>
               <w:top w:w="80" w:type="dxa"/>
-              <w:left w:w="100" w:type="dxa"/>
-              <w:bottom w:w="40" w:type="dxa"/>
-              <w:right w:w="80" w:type="dxa"/>
-            </w:tcMar>
-            <w:vAlign w:val="center"/>
-          </w:tcPr>
-          <w:p>
-            <w:pPr>
-              <w:jc w:val="center"/>
-              <w:rPr>
-                <w:lang w:val="es-MX"/>
-              </w:rPr>
-            </w:pPr>
-          </w:p>
-        </w:tc>
-        <w:tc>
-          <w:tcPr>
-            <w:tcW w:w="8740" w:type="dxa"/>
-            <w:tcBorders>
-              <w:top w:val="single" w:sz="4" w:space="0" w:color="CCCCCC"/>
-              <w:left w:val="single" w:sz="4" w:space="0" w:color="CCCCCC"/>
-              <w:bottom w:val="single" w:sz="4" w:space="0" w:color="CCCCCC"/>
-              <w:right w:val="single" w:sz="4" w:space="0" w:color="CCCCCC"/>
-            </w:tcBorders>
-            <w:shd w:val="clear" w:color="auto" w:fill="F2F2F2"/>
-            <w:tcMar>
-              <w:top w:w="80" w:type="dxa"/>
               <w:left w:w="120" w:type="dxa"/>
               <w:bottom w:w="40" w:type="dxa"/>
               <w:right w:w="120" w:type="dxa"/>
@@ -899,7 +1112,7 @@
                 <w:szCs w:val="22"/>
                 <w:lang w:val="es-MX"/>
               </w:rPr>
-              <w:t>ISO 27001 es como los requisitos no funcionales del sistema: defines qué debe cumplir.</w:t>
+              <w:t>NIST CSF es como el diseño de arquitectura: te dice cómo estructurar tu respuesta al riesgo.</w:t>
             </w:r>
           </w:p>
         </w:tc>
@@ -908,72 +1121,8 @@
         <w:tc>
           <w:tcPr>
             <w:tcW w:w="620" w:type="dxa"/>
-            <w:tcBorders>
-              <w:top w:val="single" w:sz="4" w:space="0" w:color="CCCCCC"/>
-              <w:left w:val="single" w:sz="4" w:space="0" w:color="CCCCCC"/>
-              <w:bottom w:val="single" w:sz="4" w:space="0" w:color="CCCCCC"/>
-              <w:right w:val="single" w:sz="4" w:space="0" w:color="CCCCCC"/>
-            </w:tcBorders>
-            <w:shd w:val="clear" w:color="auto" w:fill="F2F2F2"/>
-            <w:tcMar>
-              <w:top w:w="80" w:type="dxa"/>
-              <w:left w:w="100" w:type="dxa"/>
-              <w:bottom w:w="40" w:type="dxa"/>
-              <w:right w:w="80" w:type="dxa"/>
-            </w:tcMar>
-            <w:vAlign w:val="center"/>
-          </w:tcPr>
-          <w:p>
-            <w:pPr>
-              <w:jc w:val="center"/>
-              <w:rPr>
-                <w:lang w:val="es-MX"/>
-              </w:rPr>
-            </w:pPr>
-          </w:p>
-        </w:tc>
-        <w:tc>
-          <w:tcPr>
-            <w:tcW w:w="8740" w:type="dxa"/>
-            <w:tcBorders>
-              <w:top w:val="single" w:sz="4" w:space="0" w:color="CCCCCC"/>
-              <w:left w:val="single" w:sz="4" w:space="0" w:color="CCCCCC"/>
-              <w:bottom w:val="single" w:sz="4" w:space="0" w:color="CCCCCC"/>
-              <w:right w:val="single" w:sz="4" w:space="0" w:color="CCCCCC"/>
-            </w:tcBorders>
-            <w:shd w:val="clear" w:color="auto" w:fill="F2F2F2"/>
-            <w:tcMar>
-              <w:top w:w="80" w:type="dxa"/>
-              <w:left w:w="120" w:type="dxa"/>
-              <w:bottom w:w="40" w:type="dxa"/>
-              <w:right w:w="120" w:type="dxa"/>
-            </w:tcMar>
-          </w:tcPr>
-          <w:p>
-            <w:pPr>
-              <w:spacing w:before="30" w:after="30"/>
-              <w:rPr>
-                <w:lang w:val="es-MX"/>
-              </w:rPr>
-            </w:pPr>
-            <w:r>
-              <w:rPr>
-                <w:rFonts w:ascii="Arial" w:eastAsia="Arial" w:hAnsi="Arial" w:cs="Arial"/>
-                <w:sz w:val="22"/>
-                <w:szCs w:val="22"/>
-                <w:lang w:val="es-MX"/>
-              </w:rPr>
-              <w:t>NIST CSF es como el diseño de arquitectura: te dice cómo estructurar tu respuesta al riesgo.</w:t>
-            </w:r>
-          </w:p>
-        </w:tc>
-      </w:tr>
-      <w:tr>
-        <w:tc>
-          <w:tcPr>
-            <w:tcW w:w="620" w:type="dxa"/>
-            <w:tcBorders>
-              <w:top w:val="single" w:sz="4" w:space="0" w:color="CCCCCC"/>
+            <w:vMerge/>
+            <w:tcBorders>
               <w:left w:val="single" w:sz="4" w:space="0" w:color="CCCCCC"/>
               <w:bottom w:val="single" w:sz="4" w:space="0" w:color="CCCCCC"/>
               <w:right w:val="single" w:sz="4" w:space="0" w:color="CCCCCC"/>
@@ -7821,6 +7970,7 @@
                 <w:rFonts w:ascii="Segoe UI Emoji" w:eastAsia="Segoe UI Emoji" w:hAnsi="Segoe UI Emoji" w:cs="Segoe UI Emoji"/>
                 <w:sz w:val="24"/>
                 <w:szCs w:val="24"/>
+                <w:lang w:val="es-MX"/>
               </w:rPr>
               <w:t xml:space="preserve">  </w:t>
             </w:r>
@@ -7854,34 +8004,7 @@
                 <w:szCs w:val="22"/>
                 <w:lang w:val="es-MX"/>
               </w:rPr>
-              <w:t>Una empresa emergente</w:t>
-            </w:r>
-            <w:r>
-              <w:rPr>
-                <w:rFonts w:ascii="Arial" w:eastAsia="Arial" w:hAnsi="Arial" w:cs="Arial"/>
-                <w:sz w:val="22"/>
-                <w:szCs w:val="22"/>
-                <w:lang w:val="es-MX"/>
-              </w:rPr>
-              <w:t xml:space="preserve"> de </w:t>
-            </w:r>
-            <w:r>
-              <w:rPr>
-                <w:rFonts w:ascii="Arial" w:eastAsia="Arial" w:hAnsi="Arial" w:cs="Arial"/>
-                <w:sz w:val="22"/>
-                <w:szCs w:val="22"/>
-                <w:lang w:val="es-MX"/>
-              </w:rPr>
-              <w:t>Fintech</w:t>
-            </w:r>
-            <w:r>
-              <w:rPr>
-                <w:rFonts w:ascii="Arial" w:eastAsia="Arial" w:hAnsi="Arial" w:cs="Arial"/>
-                <w:sz w:val="22"/>
-                <w:szCs w:val="22"/>
-                <w:lang w:val="es-MX"/>
-              </w:rPr>
-              <w:t xml:space="preserve"> mexicana debe cumplir con la CNBV y también quiere exportar a Europa (GDPR). ¿Qué marco o combinación de marcos le recomendarías como punto de partida y por qué?</w:t>
+              <w:t>Una empresa emergente de Fintech mexicana debe cumplir con la CNBV y también quiere exportar a Europa (GDPR). ¿Qué marco o combinación de marcos le recomendarías como punto de partida y por qué?</w:t>
             </w:r>
           </w:p>
           <w:p>
@@ -8028,6 +8151,7 @@
                 <w:rFonts w:ascii="Segoe UI Emoji" w:eastAsia="Segoe UI Emoji" w:hAnsi="Segoe UI Emoji" w:cs="Segoe UI Emoji"/>
                 <w:sz w:val="24"/>
                 <w:szCs w:val="24"/>
+                <w:lang w:val="es-MX"/>
               </w:rPr>
               <w:t xml:space="preserve">  </w:t>
             </w:r>
@@ -8199,8 +8323,8 @@
       </w:pPr>
     </w:p>
     <w:sectPr>
-      <w:headerReference w:type="default" r:id="rId8"/>
-      <w:footerReference w:type="default" r:id="rId9"/>
+      <w:headerReference w:type="default" r:id="rId10"/>
+      <w:footerReference w:type="default" r:id="rId11"/>
       <w:pgSz w:w="12240" w:h="15840"/>
       <w:pgMar w:top="1440" w:right="1440" w:bottom="1440" w:left="1440" w:header="708" w:footer="708" w:gutter="0"/>
       <w:cols w:space="720"/>
@@ -8268,57 +8392,106 @@
   <w:p>
     <w:pPr>
       <w:pBdr>
-        <w:bottom w:val="single" w:sz="4" w:space="0" w:color="1A5E36"/>
+        <w:bottom w:val="single" w:sz="4" w:space="2" w:color="CCCCCC"/>
       </w:pBdr>
-      <w:spacing w:after="100"/>
+      <w:tabs>
+        <w:tab w:val="right" w:pos="9360"/>
+      </w:tabs>
+      <w:spacing w:after="80"/>
       <w:rPr>
         <w:lang w:val="es-MX"/>
       </w:rPr>
     </w:pPr>
     <w:r>
       <w:rPr>
-        <w:color w:val="999999"/>
-        <w:sz w:val="17"/>
-        <w:szCs w:val="17"/>
+        <w:rFonts w:ascii="Arial" w:eastAsia="Arial" w:hAnsi="Arial" w:cs="Arial"/>
+        <w:color w:val="888888"/>
+        <w:sz w:val="18"/>
+        <w:szCs w:val="18"/>
         <w:lang w:val="es-MX"/>
       </w:rPr>
-      <w:t>[</w:t>
+      <w:t xml:space="preserve">Arquitectura de Sistemas de </w:t>
     </w:r>
     <w:r>
       <w:rPr>
-        <w:color w:val="999999"/>
-        <w:sz w:val="17"/>
-        <w:szCs w:val="17"/>
+        <w:rFonts w:ascii="Arial" w:eastAsia="Arial" w:hAnsi="Arial" w:cs="Arial"/>
+        <w:color w:val="888888"/>
+        <w:sz w:val="18"/>
+        <w:szCs w:val="18"/>
         <w:lang w:val="es-MX"/>
       </w:rPr>
-      <w:t>Normativas, Estándares y Ciclo de Vida de la Arquitectura de Seguridad</w:t>
+      <w:t>Seguridad |</w:t>
     </w:r>
     <w:r>
       <w:rPr>
-        <w:color w:val="999999"/>
-        <w:sz w:val="17"/>
-        <w:szCs w:val="17"/>
+        <w:rFonts w:ascii="Arial" w:eastAsia="Arial" w:hAnsi="Arial" w:cs="Arial"/>
+        <w:color w:val="888888"/>
+        <w:sz w:val="18"/>
+        <w:szCs w:val="18"/>
         <w:lang w:val="es-MX"/>
       </w:rPr>
-      <w:t xml:space="preserve">] | Guía de </w:t>
+      <w:t xml:space="preserve"> CUGDL — UDG</w:t>
     </w:r>
     <w:r>
       <w:rPr>
-        <w:color w:val="999999"/>
-        <w:sz w:val="17"/>
-        <w:szCs w:val="17"/>
+        <w:rFonts w:ascii="Arial" w:eastAsia="Arial" w:hAnsi="Arial" w:cs="Arial"/>
+        <w:color w:val="888888"/>
+        <w:sz w:val="18"/>
+        <w:szCs w:val="18"/>
         <w:lang w:val="es-MX"/>
       </w:rPr>
-      <w:t>Estudio</w:t>
+      <w:tab/>
+      <w:t>U</w:t>
     </w:r>
     <w:r>
       <w:rPr>
-        <w:color w:val="999999"/>
-        <w:sz w:val="17"/>
-        <w:szCs w:val="17"/>
+        <w:rFonts w:ascii="Arial" w:eastAsia="Arial" w:hAnsi="Arial" w:cs="Arial"/>
+        <w:color w:val="888888"/>
+        <w:sz w:val="18"/>
+        <w:szCs w:val="18"/>
         <w:lang w:val="es-MX"/>
       </w:rPr>
-      <w:t xml:space="preserve"> | Arquitectura de Sistemas de Seguridad | CUGDL UDG</w:t>
+      <w:t xml:space="preserve">nidad </w:t>
+    </w:r>
+    <w:r>
+      <w:rPr>
+        <w:rFonts w:ascii="Arial" w:eastAsia="Arial" w:hAnsi="Arial" w:cs="Arial"/>
+        <w:color w:val="888888"/>
+        <w:sz w:val="18"/>
+        <w:szCs w:val="18"/>
+        <w:lang w:val="es-MX"/>
+      </w:rPr>
+      <w:t>1 · Sem</w:t>
+    </w:r>
+    <w:r>
+      <w:rPr>
+        <w:rFonts w:ascii="Arial" w:eastAsia="Arial" w:hAnsi="Arial" w:cs="Arial"/>
+        <w:color w:val="888888"/>
+        <w:sz w:val="18"/>
+        <w:szCs w:val="18"/>
+        <w:lang w:val="es-MX"/>
+      </w:rPr>
+      <w:t>ana</w:t>
+    </w:r>
+    <w:r>
+      <w:rPr>
+        <w:rFonts w:ascii="Arial" w:eastAsia="Arial" w:hAnsi="Arial" w:cs="Arial"/>
+        <w:color w:val="888888"/>
+        <w:sz w:val="18"/>
+        <w:szCs w:val="18"/>
+        <w:lang w:val="es-MX"/>
+      </w:rPr>
+      <w:t xml:space="preserve"> </w:t>
+    </w:r>
+    <w:r>
+      <w:rPr>
+        <w:rFonts w:ascii="Arial" w:eastAsia="Arial" w:hAnsi="Arial" w:cs="Arial"/>
+        <w:color w:val="888888"/>
+        <w:sz w:val="18"/>
+        <w:szCs w:val="18"/>
+        <w:lang w:val="es-MX"/>
+      </w:rPr>
+      <w:t>2</w:t>
     </w:r>
   </w:p>
   <w:p>

</xml_diff>